<commit_message>
Odrađeni KV3-5, projekt je gotov.
</commit_message>
<xml_diff>
--- a/documents/vp-kv1-jurajdurcevic.docx
+++ b/documents/vp-kv1-jurajdurcevic.docx
@@ -138,103 +138,178 @@
           <w:b/>
           <w:bCs/>
         </w:rPr>
-        <w:t>Opis problema:</w:t>
-      </w:r>
-      <w:r>
+        <w:t xml:space="preserve">Opis problema: </w:t>
+      </w:r>
+    </w:p>
+    <w:p>
+      <w:pPr>
+        <w:spacing w:before="240" w:after="240"/>
+      </w:pPr>
+      <w:r>
+        <w:t>U današnje vrijeme postoji veliki broj Yu-Gi-Oh! karata — dataset sadrži preko 13.000 unosa s desecima atributa po karti (napad, obrana, razina, tip, efekt, popularnost, status zabrane itd.). Takva količina podataka je korisna, ali i nepregledna za prosječnog korisnika. Igrači i analitičari teško mogu brzo i intuitivno pronaći najmoćnije I najpopularnije karte.</w:t>
+      </w:r>
+    </w:p>
+    <w:p>
+      <w:pPr>
+        <w:spacing w:before="240" w:after="240"/>
         <w:rPr>
           <w:b/>
           <w:bCs/>
         </w:rPr>
-        <w:t xml:space="preserve"> </w:t>
-      </w:r>
-    </w:p>
-    <w:p>
-      <w:pPr>
-        <w:spacing w:before="240" w:after="240"/>
-      </w:pPr>
-      <w:r>
-        <w:t>Dataset od preko 13 000 karata s desecima atributa (ATK, DEF, Level, views, ban-status, itd.) preopterećen je informacijama koje je teško brzo i intuitivno pregledati te usporediti, što onemogućuje brzu identifikaciju najmoćnijih, najpopularnijih ili zabranjenih karata.</w:t>
-      </w:r>
-    </w:p>
-    <w:p>
-      <w:pPr>
-        <w:spacing w:before="240" w:after="240"/>
       </w:pPr>
       <w:r>
         <w:rPr>
           <w:b/>
           <w:bCs/>
         </w:rPr>
-        <w:t>Opis</w:t>
-      </w:r>
-      <w:r>
-        <w:t xml:space="preserve"> </w:t>
-      </w:r>
-      <w:r>
+        <w:t>Opis zadatka:</w:t>
+      </w:r>
+    </w:p>
+    <w:p>
+      <w:pPr>
+        <w:pStyle w:val="NormalWeb"/>
+        <w:rPr>
+          <w:rFonts w:ascii="Arial" w:hAnsi="Arial" w:cs="Arial"/>
+          <w:sz w:val="22"/>
+          <w:szCs w:val="22"/>
+        </w:rPr>
+      </w:pPr>
+      <w:r>
+        <w:rPr>
+          <w:rFonts w:ascii="Arial" w:hAnsi="Arial" w:cs="Arial"/>
+          <w:sz w:val="22"/>
+          <w:szCs w:val="22"/>
+        </w:rPr>
+        <w:t>Razviti web-aplikaciju koristeći D3.js koja će interaktivno vizualizirati podatke o Yu-Gi-Oh! kartama. Aplikacija će omogućiti:</w:t>
+      </w:r>
+    </w:p>
+    <w:p>
+      <w:pPr>
+        <w:pStyle w:val="NormalWeb"/>
+        <w:numPr>
+          <w:ilvl w:val="0"/>
+          <w:numId w:val="10"/>
+        </w:numPr>
+        <w:rPr>
+          <w:rFonts w:ascii="Arial" w:hAnsi="Arial" w:cs="Arial"/>
+          <w:sz w:val="22"/>
+          <w:szCs w:val="22"/>
+        </w:rPr>
+      </w:pPr>
+      <w:r>
+        <w:rPr>
+          <w:rFonts w:ascii="Arial" w:hAnsi="Arial" w:cs="Arial"/>
+          <w:sz w:val="22"/>
+          <w:szCs w:val="22"/>
+        </w:rPr>
+        <w:t>Usporedbu dviju karata pomoću spider (radar) grafa na temelju napada, obrane i razine.</w:t>
+      </w:r>
+    </w:p>
+    <w:p>
+      <w:pPr>
+        <w:pStyle w:val="NormalWeb"/>
+        <w:numPr>
+          <w:ilvl w:val="0"/>
+          <w:numId w:val="10"/>
+        </w:numPr>
+        <w:rPr>
+          <w:rFonts w:ascii="Arial" w:hAnsi="Arial" w:cs="Arial"/>
+          <w:sz w:val="22"/>
+          <w:szCs w:val="22"/>
+        </w:rPr>
+      </w:pPr>
+      <w:r>
+        <w:rPr>
+          <w:rFonts w:ascii="Arial" w:hAnsi="Arial" w:cs="Arial"/>
+          <w:sz w:val="22"/>
+          <w:szCs w:val="22"/>
+        </w:rPr>
+        <w:t xml:space="preserve">Prikaz </w:t>
+      </w:r>
+      <w:r>
+        <w:rPr>
+          <w:rFonts w:ascii="Arial" w:hAnsi="Arial" w:cs="Arial"/>
+          <w:sz w:val="22"/>
+          <w:szCs w:val="22"/>
+        </w:rPr>
+        <w:t xml:space="preserve">10 </w:t>
+      </w:r>
+      <w:r>
+        <w:rPr>
+          <w:rFonts w:ascii="Arial" w:hAnsi="Arial" w:cs="Arial"/>
+          <w:sz w:val="22"/>
+          <w:szCs w:val="22"/>
+        </w:rPr>
+        <w:t>najpopularnijih karata prema broju pregleda, pozitivnim i negativnim ocjenama</w:t>
+      </w:r>
+      <w:r>
+        <w:rPr>
+          <w:rFonts w:ascii="Arial" w:hAnsi="Arial" w:cs="Arial"/>
+          <w:sz w:val="22"/>
+          <w:szCs w:val="22"/>
+        </w:rPr>
+        <w:t>, te oznaciti koje su staple I zabranjene karte od njih.</w:t>
+      </w:r>
+    </w:p>
+    <w:p>
+      <w:pPr>
+        <w:pStyle w:val="NormalWeb"/>
+        <w:numPr>
+          <w:ilvl w:val="0"/>
+          <w:numId w:val="10"/>
+        </w:numPr>
+        <w:rPr>
+          <w:rFonts w:ascii="Arial" w:hAnsi="Arial" w:cs="Arial"/>
+          <w:sz w:val="22"/>
+          <w:szCs w:val="22"/>
+        </w:rPr>
+      </w:pPr>
+      <w:r>
+        <w:rPr>
+          <w:rFonts w:ascii="Arial" w:hAnsi="Arial" w:cs="Arial"/>
+          <w:sz w:val="22"/>
+          <w:szCs w:val="22"/>
+        </w:rPr>
+        <w:t>Filtriranje karata po različitim atributima (tip, rasa, efekt, arhetip itd.).</w:t>
+      </w:r>
+    </w:p>
+    <w:p>
+      <w:pPr>
+        <w:spacing w:before="240" w:after="240"/>
         <w:rPr>
           <w:b/>
           <w:bCs/>
         </w:rPr>
-        <w:t>zadatka</w:t>
-      </w:r>
-      <w:r>
-        <w:t>:</w:t>
-      </w:r>
-    </w:p>
-    <w:p>
-      <w:pPr>
-        <w:spacing w:before="240" w:after="240"/>
-      </w:pPr>
-      <w:r>
-        <w:t>Razviti web-aplikaciju u D3.js koja čita podatke o kartama</w:t>
-      </w:r>
-      <w:r>
-        <w:t xml:space="preserve">, </w:t>
-      </w:r>
-      <w:r>
-        <w:t>obrađuje ih i prikazuje interaktivne grafikone za snagu karata (ATK vs DEF vs Level), popularnost (views, upvotes/downvotes, staple) i status zabrana (TCG/OCG/Goat) kroz vrijeme, uz filtere, sortiranje i mogućnost usporedbe odabranih karata.</w:t>
-      </w:r>
-      <w:r>
-        <w:t xml:space="preserve"> Podaci će biti prikazani samo za OCG format.</w:t>
-      </w:r>
-    </w:p>
-    <w:p>
-      <w:pPr>
-        <w:spacing w:before="240" w:after="240"/>
+      </w:pPr>
+      <w:r>
         <w:rPr>
           <w:b/>
           <w:bCs/>
         </w:rPr>
-      </w:pPr>
-      <w:r>
+        <w:t>Cilj projekta:</w:t>
+      </w:r>
+    </w:p>
+    <w:p>
+      <w:pPr>
+        <w:spacing w:before="240" w:after="240"/>
+      </w:pPr>
+      <w:r>
+        <w:t>Omogućiti Yu-Gi-Oh! igračima, kolekcionarima i analitičarima brz, pregledan i intuitivan uvid u karakteristike karata te promjene u njihovoj popularnosti</w:t>
+      </w:r>
+    </w:p>
+    <w:p>
+      <w:pPr>
+        <w:spacing w:before="240" w:after="240"/>
         <w:rPr>
           <w:b/>
           <w:bCs/>
         </w:rPr>
-        <w:t>Cilj projekta:</w:t>
-      </w:r>
-    </w:p>
-    <w:p>
-      <w:pPr>
-        <w:spacing w:before="240" w:after="240"/>
-      </w:pPr>
-      <w:r>
-        <w:t>Omogućiti igračima i analitičarima Yu-Gi-Oh! brz, jasan i dinamičan uvid u ključne karakteristike karata te promjene u popularnosti i restrikcijama, eliminirajući potrebu za ručnim pretraživanjem ili složenim upitima nad velikim datasetom.</w:t>
-      </w:r>
-    </w:p>
-    <w:p>
-      <w:pPr>
-        <w:spacing w:before="240" w:after="240"/>
+      </w:pPr>
+      <w:r>
         <w:rPr>
           <w:b/>
           <w:bCs/>
         </w:rPr>
-      </w:pPr>
-      <w:r>
-        <w:rPr>
-          <w:b/>
-          <w:bCs/>
-        </w:rPr>
         <w:t>Poveznica na git repozitorij projekta:</w:t>
       </w:r>
     </w:p>
@@ -242,7 +317,7 @@
       <w:pPr>
         <w:spacing w:before="240" w:after="240"/>
       </w:pPr>
-      <w:hyperlink r:id="rId5" w:history="1">
+      <w:hyperlink r:id="rId7" w:history="1">
         <w:r>
           <w:rPr>
             <w:rStyle w:val="Hyperlink"/>
@@ -346,10 +421,9 @@
         <w:rPr>
           <w:lang w:val="hr-HR"/>
         </w:rPr>
-        <w:lastRenderedPageBreak/>
         <w:t>Dataset je preuzet sa stranice kaggle (</w:t>
       </w:r>
-      <w:hyperlink r:id="rId6" w:history="1">
+      <w:hyperlink r:id="rId8" w:history="1">
         <w:r>
           <w:rPr>
             <w:rStyle w:val="Hyperlink"/>
@@ -389,7 +463,7 @@
         </w:rPr>
         <w:t xml:space="preserve">preuzete s </w:t>
       </w:r>
-      <w:hyperlink r:id="rId7" w:history="1">
+      <w:hyperlink r:id="rId9" w:history="1">
         <w:r>
           <w:rPr>
             <w:rStyle w:val="Hyperlink"/>
@@ -1129,7 +1203,7 @@
           <w:lang w:val="en-US"/>
         </w:rPr>
       </w:pPr>
-      <w:hyperlink r:id="rId8" w:history="1">
+      <w:hyperlink r:id="rId10" w:history="1">
         <w:r>
           <w:rPr>
             <w:rStyle w:val="Hyperlink"/>
@@ -1164,6 +1238,7 @@
       </w:pPr>
       <w:r>
         <w:rPr>
+          <w:noProof/>
           <w:lang w:val="en-US"/>
         </w:rPr>
         <w:object w:dxaOrig="9360" w:dyaOrig="11926" w14:anchorId="013046EC">
@@ -1186,10 +1261,10 @@
             <v:path o:extrusionok="f" gradientshapeok="t" o:connecttype="rect"/>
             <o:lock v:ext="edit" aspectratio="t"/>
           </v:shapetype>
-          <v:shape id="_x0000_i1025" type="#_x0000_t75" style="width:468pt;height:595.5pt" o:ole="">
-            <v:imagedata r:id="rId9" o:title=""/>
+          <v:shape id="_x0000_i1025" type="#_x0000_t75" alt="" style="width:468.35pt;height:595.55pt;mso-width-percent:0;mso-height-percent:0;mso-width-percent:0;mso-height-percent:0" o:ole="">
+            <v:imagedata r:id="rId11" o:title=""/>
           </v:shape>
-          <o:OLEObject Type="Embed" ProgID="Word.OpenDocumentText.12" ShapeID="_x0000_i1025" DrawAspect="Content" ObjectID="_1809362753" r:id="rId10"/>
+          <o:OLEObject Type="Embed" ProgID="Word.OpenDocumentText.12" ShapeID="_x0000_i1025" DrawAspect="Content" ObjectID="_1810295664" r:id="rId12"/>
         </w:object>
       </w:r>
     </w:p>
@@ -1243,14 +1318,8 @@
         <w:rPr>
           <w:i/>
         </w:rPr>
-        <w:t xml:space="preserve">Predložiti moguće načine prikaza podataka koji će pomoći u razumijevanju podataka i rješavanju problema koji je postavljen u prvom zadatku. Ovo može </w:t>
-      </w:r>
-      <w:r>
-        <w:rPr>
-          <w:i/>
-        </w:rPr>
         <w:lastRenderedPageBreak/>
-        <w:t>uključivati odabir najprikladnijeg načina vizualizacije podataka, ali to je zadatak iduće vježbe.</w:t>
+        <w:t>Predložiti moguće načine prikaza podataka koji će pomoći u razumijevanju podataka i rješavanju problema koji je postavljen u prvom zadatku. Ovo može uključivati odabir najprikladnijeg načina vizualizacije podataka, ali to je zadatak iduće vježbe.</w:t>
       </w:r>
       <w:bookmarkStart w:id="6" w:name="_smxrkz6d6wy8" w:colFirst="0" w:colLast="0"/>
       <w:bookmarkEnd w:id="6"/>
@@ -1578,6 +1647,7 @@
         <w:spacing w:before="240" w:after="240"/>
       </w:pPr>
       <w:r>
+        <w:lastRenderedPageBreak/>
         <w:t>– Pomaže da se odmah uoče klasteri (slabe, srednje i jake karte) i outlieri.</w:t>
       </w:r>
     </w:p>
@@ -1646,6 +1716,12 @@
       </w:r>
     </w:p>
     <w:sectPr>
+      <w:headerReference w:type="even" r:id="rId13"/>
+      <w:headerReference w:type="default" r:id="rId14"/>
+      <w:footerReference w:type="even" r:id="rId15"/>
+      <w:footerReference w:type="default" r:id="rId16"/>
+      <w:headerReference w:type="first" r:id="rId17"/>
+      <w:footerReference w:type="first" r:id="rId18"/>
       <w:pgSz w:w="11906" w:h="16838"/>
       <w:pgMar w:top="1080" w:right="720" w:bottom="720" w:left="1080" w:header="720" w:footer="720" w:gutter="0"/>
       <w:cols w:space="720"/>
@@ -1654,9 +1730,268 @@
 </w:document>
 </file>
 
+<file path=word/endnotes.xml><?xml version="1.0" encoding="utf-8"?>
+<w:endnotes xmlns:wpc="http://schemas.microsoft.com/office/word/2010/wordprocessingCanvas" xmlns:cx="http://schemas.microsoft.com/office/drawing/2014/chartex" xmlns:cx1="http://schemas.microsoft.com/office/drawing/2015/9/8/chartex" xmlns:cx2="http://schemas.microsoft.com/office/drawing/2015/10/21/chartex" xmlns:cx3="http://schemas.microsoft.com/office/drawing/2016/5/9/chartex" xmlns:cx4="http://schemas.microsoft.com/office/drawing/2016/5/10/chartex" xmlns:cx5="http://schemas.microsoft.com/office/drawing/2016/5/11/chartex" xmlns:cx6="http://schemas.microsoft.com/office/drawing/2016/5/12/chartex" xmlns:cx7="http://schemas.microsoft.com/office/drawing/2016/5/13/chartex" xmlns:cx8="http://schemas.microsoft.com/office/drawing/2016/5/14/chartex" xmlns:mc="http://schemas.openxmlformats.org/markup-compatibility/2006" xmlns:aink="http://schemas.microsoft.com/office/drawing/2016/ink" xmlns:am3d="http://schemas.microsoft.com/office/drawing/2017/model3d" xmlns:o="urn:schemas-microsoft-com:office:office" xmlns:oel="http://schemas.microsoft.com/office/2019/extlst" xmlns:r="http://schemas.openxmlformats.org/officeDocument/2006/relationships" xmlns:m="http://schemas.openxmlformats.org/officeDocument/2006/math" xmlns:v="urn:schemas-microsoft-com:vml" xmlns:wp14="http://schemas.microsoft.com/office/word/2010/wordprocessingDrawing" xmlns:wp="http://schemas.openxmlformats.org/drawingml/2006/wordprocessingDrawing" xmlns:w10="urn:schemas-microsoft-com:office:word" xmlns:w="http://schemas.openxmlformats.org/wordprocessingml/2006/main" xmlns:w14="http://schemas.microsoft.com/office/word/2010/wordml" xmlns:w15="http://schemas.microsoft.com/office/word/2012/wordml" xmlns:w16cex="http://schemas.microsoft.com/office/word/2018/wordml/cex" xmlns:w16cid="http://schemas.microsoft.com/office/word/2016/wordml/cid" xmlns:w16="http://schemas.microsoft.com/office/word/2018/wordml" xmlns:w16du="http://schemas.microsoft.com/office/word/2023/wordml/word16du" xmlns:w16sdtdh="http://schemas.microsoft.com/office/word/2020/wordml/sdtdatahash" xmlns:w16sdtfl="http://schemas.microsoft.com/office/word/2024/wordml/sdtformatlock" xmlns:w16se="http://schemas.microsoft.com/office/word/2015/wordml/symex" xmlns:wpg="http://schemas.microsoft.com/office/word/2010/wordprocessingGroup" xmlns:wpi="http://schemas.microsoft.com/office/word/2010/wordprocessingInk" xmlns:wne="http://schemas.microsoft.com/office/word/2006/wordml" xmlns:wps="http://schemas.microsoft.com/office/word/2010/wordprocessingShape" mc:Ignorable="w14 w15 w16se w16cid w16 w16cex w16sdtdh w16sdtfl w16du wp14">
+  <w:endnote w:type="separator" w:id="-1">
+    <w:p>
+      <w:pPr>
+        <w:spacing w:line="240" w:lineRule="auto"/>
+      </w:pPr>
+      <w:r>
+        <w:separator/>
+      </w:r>
+    </w:p>
+  </w:endnote>
+  <w:endnote w:type="continuationSeparator" w:id="0">
+    <w:p>
+      <w:pPr>
+        <w:spacing w:line="240" w:lineRule="auto"/>
+      </w:pPr>
+      <w:r>
+        <w:continuationSeparator/>
+      </w:r>
+    </w:p>
+  </w:endnote>
+</w:endnotes>
+</file>
+
+<file path=word/footer1.xml><?xml version="1.0" encoding="utf-8"?>
+<w:ftr xmlns:wpc="http://schemas.microsoft.com/office/word/2010/wordprocessingCanvas" xmlns:cx="http://schemas.microsoft.com/office/drawing/2014/chartex" xmlns:cx1="http://schemas.microsoft.com/office/drawing/2015/9/8/chartex" xmlns:cx2="http://schemas.microsoft.com/office/drawing/2015/10/21/chartex" xmlns:cx3="http://schemas.microsoft.com/office/drawing/2016/5/9/chartex" xmlns:cx4="http://schemas.microsoft.com/office/drawing/2016/5/10/chartex" xmlns:cx5="http://schemas.microsoft.com/office/drawing/2016/5/11/chartex" xmlns:cx6="http://schemas.microsoft.com/office/drawing/2016/5/12/chartex" xmlns:cx7="http://schemas.microsoft.com/office/drawing/2016/5/13/chartex" xmlns:cx8="http://schemas.microsoft.com/office/drawing/2016/5/14/chartex" xmlns:mc="http://schemas.openxmlformats.org/markup-compatibility/2006" xmlns:aink="http://schemas.microsoft.com/office/drawing/2016/ink" xmlns:am3d="http://schemas.microsoft.com/office/drawing/2017/model3d" xmlns:o="urn:schemas-microsoft-com:office:office" xmlns:oel="http://schemas.microsoft.com/office/2019/extlst" xmlns:r="http://schemas.openxmlformats.org/officeDocument/2006/relationships" xmlns:m="http://schemas.openxmlformats.org/officeDocument/2006/math" xmlns:v="urn:schemas-microsoft-com:vml" xmlns:wp14="http://schemas.microsoft.com/office/word/2010/wordprocessingDrawing" xmlns:wp="http://schemas.openxmlformats.org/drawingml/2006/wordprocessingDrawing" xmlns:w10="urn:schemas-microsoft-com:office:word" xmlns:w="http://schemas.openxmlformats.org/wordprocessingml/2006/main" xmlns:w14="http://schemas.microsoft.com/office/word/2010/wordml" xmlns:w15="http://schemas.microsoft.com/office/word/2012/wordml" xmlns:w16cex="http://schemas.microsoft.com/office/word/2018/wordml/cex" xmlns:w16cid="http://schemas.microsoft.com/office/word/2016/wordml/cid" xmlns:w16="http://schemas.microsoft.com/office/word/2018/wordml" xmlns:w16du="http://schemas.microsoft.com/office/word/2023/wordml/word16du" xmlns:w16sdtdh="http://schemas.microsoft.com/office/word/2020/wordml/sdtdatahash" xmlns:w16sdtfl="http://schemas.microsoft.com/office/word/2024/wordml/sdtformatlock" xmlns:w16se="http://schemas.microsoft.com/office/word/2015/wordml/symex" xmlns:wpg="http://schemas.microsoft.com/office/word/2010/wordprocessingGroup" xmlns:wpi="http://schemas.microsoft.com/office/word/2010/wordprocessingInk" xmlns:wne="http://schemas.microsoft.com/office/word/2006/wordml" xmlns:wps="http://schemas.microsoft.com/office/word/2010/wordprocessingShape" mc:Ignorable="w14 w15 w16se w16cid w16 w16cex w16sdtdh w16sdtfl w16du wp14">
+  <w:p>
+    <w:pPr>
+      <w:pStyle w:val="Footer"/>
+    </w:pPr>
+  </w:p>
+</w:ftr>
+</file>
+
+<file path=word/footer2.xml><?xml version="1.0" encoding="utf-8"?>
+<w:ftr xmlns:wpc="http://schemas.microsoft.com/office/word/2010/wordprocessingCanvas" xmlns:cx="http://schemas.microsoft.com/office/drawing/2014/chartex" xmlns:cx1="http://schemas.microsoft.com/office/drawing/2015/9/8/chartex" xmlns:cx2="http://schemas.microsoft.com/office/drawing/2015/10/21/chartex" xmlns:cx3="http://schemas.microsoft.com/office/drawing/2016/5/9/chartex" xmlns:cx4="http://schemas.microsoft.com/office/drawing/2016/5/10/chartex" xmlns:cx5="http://schemas.microsoft.com/office/drawing/2016/5/11/chartex" xmlns:cx6="http://schemas.microsoft.com/office/drawing/2016/5/12/chartex" xmlns:cx7="http://schemas.microsoft.com/office/drawing/2016/5/13/chartex" xmlns:cx8="http://schemas.microsoft.com/office/drawing/2016/5/14/chartex" xmlns:mc="http://schemas.openxmlformats.org/markup-compatibility/2006" xmlns:aink="http://schemas.microsoft.com/office/drawing/2016/ink" xmlns:am3d="http://schemas.microsoft.com/office/drawing/2017/model3d" xmlns:o="urn:schemas-microsoft-com:office:office" xmlns:oel="http://schemas.microsoft.com/office/2019/extlst" xmlns:r="http://schemas.openxmlformats.org/officeDocument/2006/relationships" xmlns:m="http://schemas.openxmlformats.org/officeDocument/2006/math" xmlns:v="urn:schemas-microsoft-com:vml" xmlns:wp14="http://schemas.microsoft.com/office/word/2010/wordprocessingDrawing" xmlns:wp="http://schemas.openxmlformats.org/drawingml/2006/wordprocessingDrawing" xmlns:w10="urn:schemas-microsoft-com:office:word" xmlns:w="http://schemas.openxmlformats.org/wordprocessingml/2006/main" xmlns:w14="http://schemas.microsoft.com/office/word/2010/wordml" xmlns:w15="http://schemas.microsoft.com/office/word/2012/wordml" xmlns:w16cex="http://schemas.microsoft.com/office/word/2018/wordml/cex" xmlns:w16cid="http://schemas.microsoft.com/office/word/2016/wordml/cid" xmlns:w16="http://schemas.microsoft.com/office/word/2018/wordml" xmlns:w16du="http://schemas.microsoft.com/office/word/2023/wordml/word16du" xmlns:w16sdtdh="http://schemas.microsoft.com/office/word/2020/wordml/sdtdatahash" xmlns:w16sdtfl="http://schemas.microsoft.com/office/word/2024/wordml/sdtformatlock" xmlns:w16se="http://schemas.microsoft.com/office/word/2015/wordml/symex" xmlns:wpg="http://schemas.microsoft.com/office/word/2010/wordprocessingGroup" xmlns:wpi="http://schemas.microsoft.com/office/word/2010/wordprocessingInk" xmlns:wne="http://schemas.microsoft.com/office/word/2006/wordml" xmlns:wps="http://schemas.microsoft.com/office/word/2010/wordprocessingShape" mc:Ignorable="w14 w15 w16se w16cid w16 w16cex w16sdtdh w16sdtfl w16du wp14">
+  <w:p>
+    <w:pPr>
+      <w:pStyle w:val="Footer"/>
+    </w:pPr>
+  </w:p>
+</w:ftr>
+</file>
+
+<file path=word/footer3.xml><?xml version="1.0" encoding="utf-8"?>
+<w:ftr xmlns:wpc="http://schemas.microsoft.com/office/word/2010/wordprocessingCanvas" xmlns:cx="http://schemas.microsoft.com/office/drawing/2014/chartex" xmlns:cx1="http://schemas.microsoft.com/office/drawing/2015/9/8/chartex" xmlns:cx2="http://schemas.microsoft.com/office/drawing/2015/10/21/chartex" xmlns:cx3="http://schemas.microsoft.com/office/drawing/2016/5/9/chartex" xmlns:cx4="http://schemas.microsoft.com/office/drawing/2016/5/10/chartex" xmlns:cx5="http://schemas.microsoft.com/office/drawing/2016/5/11/chartex" xmlns:cx6="http://schemas.microsoft.com/office/drawing/2016/5/12/chartex" xmlns:cx7="http://schemas.microsoft.com/office/drawing/2016/5/13/chartex" xmlns:cx8="http://schemas.microsoft.com/office/drawing/2016/5/14/chartex" xmlns:mc="http://schemas.openxmlformats.org/markup-compatibility/2006" xmlns:aink="http://schemas.microsoft.com/office/drawing/2016/ink" xmlns:am3d="http://schemas.microsoft.com/office/drawing/2017/model3d" xmlns:o="urn:schemas-microsoft-com:office:office" xmlns:oel="http://schemas.microsoft.com/office/2019/extlst" xmlns:r="http://schemas.openxmlformats.org/officeDocument/2006/relationships" xmlns:m="http://schemas.openxmlformats.org/officeDocument/2006/math" xmlns:v="urn:schemas-microsoft-com:vml" xmlns:wp14="http://schemas.microsoft.com/office/word/2010/wordprocessingDrawing" xmlns:wp="http://schemas.openxmlformats.org/drawingml/2006/wordprocessingDrawing" xmlns:w10="urn:schemas-microsoft-com:office:word" xmlns:w="http://schemas.openxmlformats.org/wordprocessingml/2006/main" xmlns:w14="http://schemas.microsoft.com/office/word/2010/wordml" xmlns:w15="http://schemas.microsoft.com/office/word/2012/wordml" xmlns:w16cex="http://schemas.microsoft.com/office/word/2018/wordml/cex" xmlns:w16cid="http://schemas.microsoft.com/office/word/2016/wordml/cid" xmlns:w16="http://schemas.microsoft.com/office/word/2018/wordml" xmlns:w16du="http://schemas.microsoft.com/office/word/2023/wordml/word16du" xmlns:w16sdtdh="http://schemas.microsoft.com/office/word/2020/wordml/sdtdatahash" xmlns:w16sdtfl="http://schemas.microsoft.com/office/word/2024/wordml/sdtformatlock" xmlns:w16se="http://schemas.microsoft.com/office/word/2015/wordml/symex" xmlns:wpg="http://schemas.microsoft.com/office/word/2010/wordprocessingGroup" xmlns:wpi="http://schemas.microsoft.com/office/word/2010/wordprocessingInk" xmlns:wne="http://schemas.microsoft.com/office/word/2006/wordml" xmlns:wps="http://schemas.microsoft.com/office/word/2010/wordprocessingShape" mc:Ignorable="w14 w15 w16se w16cid w16 w16cex w16sdtdh w16sdtfl w16du wp14">
+  <w:p>
+    <w:pPr>
+      <w:pStyle w:val="Footer"/>
+    </w:pPr>
+  </w:p>
+</w:ftr>
+</file>
+
+<file path=word/footnotes.xml><?xml version="1.0" encoding="utf-8"?>
+<w:footnotes xmlns:wpc="http://schemas.microsoft.com/office/word/2010/wordprocessingCanvas" xmlns:cx="http://schemas.microsoft.com/office/drawing/2014/chartex" xmlns:cx1="http://schemas.microsoft.com/office/drawing/2015/9/8/chartex" xmlns:cx2="http://schemas.microsoft.com/office/drawing/2015/10/21/chartex" xmlns:cx3="http://schemas.microsoft.com/office/drawing/2016/5/9/chartex" xmlns:cx4="http://schemas.microsoft.com/office/drawing/2016/5/10/chartex" xmlns:cx5="http://schemas.microsoft.com/office/drawing/2016/5/11/chartex" xmlns:cx6="http://schemas.microsoft.com/office/drawing/2016/5/12/chartex" xmlns:cx7="http://schemas.microsoft.com/office/drawing/2016/5/13/chartex" xmlns:cx8="http://schemas.microsoft.com/office/drawing/2016/5/14/chartex" xmlns:mc="http://schemas.openxmlformats.org/markup-compatibility/2006" xmlns:aink="http://schemas.microsoft.com/office/drawing/2016/ink" xmlns:am3d="http://schemas.microsoft.com/office/drawing/2017/model3d" xmlns:o="urn:schemas-microsoft-com:office:office" xmlns:oel="http://schemas.microsoft.com/office/2019/extlst" xmlns:r="http://schemas.openxmlformats.org/officeDocument/2006/relationships" xmlns:m="http://schemas.openxmlformats.org/officeDocument/2006/math" xmlns:v="urn:schemas-microsoft-com:vml" xmlns:wp14="http://schemas.microsoft.com/office/word/2010/wordprocessingDrawing" xmlns:wp="http://schemas.openxmlformats.org/drawingml/2006/wordprocessingDrawing" xmlns:w10="urn:schemas-microsoft-com:office:word" xmlns:w="http://schemas.openxmlformats.org/wordprocessingml/2006/main" xmlns:w14="http://schemas.microsoft.com/office/word/2010/wordml" xmlns:w15="http://schemas.microsoft.com/office/word/2012/wordml" xmlns:w16cex="http://schemas.microsoft.com/office/word/2018/wordml/cex" xmlns:w16cid="http://schemas.microsoft.com/office/word/2016/wordml/cid" xmlns:w16="http://schemas.microsoft.com/office/word/2018/wordml" xmlns:w16du="http://schemas.microsoft.com/office/word/2023/wordml/word16du" xmlns:w16sdtdh="http://schemas.microsoft.com/office/word/2020/wordml/sdtdatahash" xmlns:w16sdtfl="http://schemas.microsoft.com/office/word/2024/wordml/sdtformatlock" xmlns:w16se="http://schemas.microsoft.com/office/word/2015/wordml/symex" xmlns:wpg="http://schemas.microsoft.com/office/word/2010/wordprocessingGroup" xmlns:wpi="http://schemas.microsoft.com/office/word/2010/wordprocessingInk" xmlns:wne="http://schemas.microsoft.com/office/word/2006/wordml" xmlns:wps="http://schemas.microsoft.com/office/word/2010/wordprocessingShape" mc:Ignorable="w14 w15 w16se w16cid w16 w16cex w16sdtdh w16sdtfl w16du wp14">
+  <w:footnote w:type="separator" w:id="-1">
+    <w:p>
+      <w:pPr>
+        <w:spacing w:line="240" w:lineRule="auto"/>
+      </w:pPr>
+      <w:r>
+        <w:separator/>
+      </w:r>
+    </w:p>
+  </w:footnote>
+  <w:footnote w:type="continuationSeparator" w:id="0">
+    <w:p>
+      <w:pPr>
+        <w:spacing w:line="240" w:lineRule="auto"/>
+      </w:pPr>
+      <w:r>
+        <w:continuationSeparator/>
+      </w:r>
+    </w:p>
+  </w:footnote>
+</w:footnotes>
+</file>
+
+<file path=word/header1.xml><?xml version="1.0" encoding="utf-8"?>
+<w:hdr xmlns:wpc="http://schemas.microsoft.com/office/word/2010/wordprocessingCanvas" xmlns:cx="http://schemas.microsoft.com/office/drawing/2014/chartex" xmlns:cx1="http://schemas.microsoft.com/office/drawing/2015/9/8/chartex" xmlns:cx2="http://schemas.microsoft.com/office/drawing/2015/10/21/chartex" xmlns:cx3="http://schemas.microsoft.com/office/drawing/2016/5/9/chartex" xmlns:cx4="http://schemas.microsoft.com/office/drawing/2016/5/10/chartex" xmlns:cx5="http://schemas.microsoft.com/office/drawing/2016/5/11/chartex" xmlns:cx6="http://schemas.microsoft.com/office/drawing/2016/5/12/chartex" xmlns:cx7="http://schemas.microsoft.com/office/drawing/2016/5/13/chartex" xmlns:cx8="http://schemas.microsoft.com/office/drawing/2016/5/14/chartex" xmlns:mc="http://schemas.openxmlformats.org/markup-compatibility/2006" xmlns:aink="http://schemas.microsoft.com/office/drawing/2016/ink" xmlns:am3d="http://schemas.microsoft.com/office/drawing/2017/model3d" xmlns:o="urn:schemas-microsoft-com:office:office" xmlns:oel="http://schemas.microsoft.com/office/2019/extlst" xmlns:r="http://schemas.openxmlformats.org/officeDocument/2006/relationships" xmlns:m="http://schemas.openxmlformats.org/officeDocument/2006/math" xmlns:v="urn:schemas-microsoft-com:vml" xmlns:wp14="http://schemas.microsoft.com/office/word/2010/wordprocessingDrawing" xmlns:wp="http://schemas.openxmlformats.org/drawingml/2006/wordprocessingDrawing" xmlns:w10="urn:schemas-microsoft-com:office:word" xmlns:w="http://schemas.openxmlformats.org/wordprocessingml/2006/main" xmlns:w14="http://schemas.microsoft.com/office/word/2010/wordml" xmlns:w15="http://schemas.microsoft.com/office/word/2012/wordml" xmlns:w16cex="http://schemas.microsoft.com/office/word/2018/wordml/cex" xmlns:w16cid="http://schemas.microsoft.com/office/word/2016/wordml/cid" xmlns:w16="http://schemas.microsoft.com/office/word/2018/wordml" xmlns:w16du="http://schemas.microsoft.com/office/word/2023/wordml/word16du" xmlns:w16sdtdh="http://schemas.microsoft.com/office/word/2020/wordml/sdtdatahash" xmlns:w16sdtfl="http://schemas.microsoft.com/office/word/2024/wordml/sdtformatlock" xmlns:w16se="http://schemas.microsoft.com/office/word/2015/wordml/symex" xmlns:wpg="http://schemas.microsoft.com/office/word/2010/wordprocessingGroup" xmlns:wpi="http://schemas.microsoft.com/office/word/2010/wordprocessingInk" xmlns:wne="http://schemas.microsoft.com/office/word/2006/wordml" xmlns:wps="http://schemas.microsoft.com/office/word/2010/wordprocessingShape" mc:Ignorable="w14 w15 w16se w16cid w16 w16cex w16sdtdh w16sdtfl w16du wp14">
+  <w:p>
+    <w:pPr>
+      <w:pStyle w:val="Header"/>
+    </w:pPr>
+  </w:p>
+</w:hdr>
+</file>
+
+<file path=word/header2.xml><?xml version="1.0" encoding="utf-8"?>
+<w:hdr xmlns:wpc="http://schemas.microsoft.com/office/word/2010/wordprocessingCanvas" xmlns:cx="http://schemas.microsoft.com/office/drawing/2014/chartex" xmlns:cx1="http://schemas.microsoft.com/office/drawing/2015/9/8/chartex" xmlns:cx2="http://schemas.microsoft.com/office/drawing/2015/10/21/chartex" xmlns:cx3="http://schemas.microsoft.com/office/drawing/2016/5/9/chartex" xmlns:cx4="http://schemas.microsoft.com/office/drawing/2016/5/10/chartex" xmlns:cx5="http://schemas.microsoft.com/office/drawing/2016/5/11/chartex" xmlns:cx6="http://schemas.microsoft.com/office/drawing/2016/5/12/chartex" xmlns:cx7="http://schemas.microsoft.com/office/drawing/2016/5/13/chartex" xmlns:cx8="http://schemas.microsoft.com/office/drawing/2016/5/14/chartex" xmlns:mc="http://schemas.openxmlformats.org/markup-compatibility/2006" xmlns:aink="http://schemas.microsoft.com/office/drawing/2016/ink" xmlns:am3d="http://schemas.microsoft.com/office/drawing/2017/model3d" xmlns:o="urn:schemas-microsoft-com:office:office" xmlns:oel="http://schemas.microsoft.com/office/2019/extlst" xmlns:r="http://schemas.openxmlformats.org/officeDocument/2006/relationships" xmlns:m="http://schemas.openxmlformats.org/officeDocument/2006/math" xmlns:v="urn:schemas-microsoft-com:vml" xmlns:wp14="http://schemas.microsoft.com/office/word/2010/wordprocessingDrawing" xmlns:wp="http://schemas.openxmlformats.org/drawingml/2006/wordprocessingDrawing" xmlns:w10="urn:schemas-microsoft-com:office:word" xmlns:w="http://schemas.openxmlformats.org/wordprocessingml/2006/main" xmlns:w14="http://schemas.microsoft.com/office/word/2010/wordml" xmlns:w15="http://schemas.microsoft.com/office/word/2012/wordml" xmlns:w16cex="http://schemas.microsoft.com/office/word/2018/wordml/cex" xmlns:w16cid="http://schemas.microsoft.com/office/word/2016/wordml/cid" xmlns:w16="http://schemas.microsoft.com/office/word/2018/wordml" xmlns:w16du="http://schemas.microsoft.com/office/word/2023/wordml/word16du" xmlns:w16sdtdh="http://schemas.microsoft.com/office/word/2020/wordml/sdtdatahash" xmlns:w16sdtfl="http://schemas.microsoft.com/office/word/2024/wordml/sdtformatlock" xmlns:w16se="http://schemas.microsoft.com/office/word/2015/wordml/symex" xmlns:wpg="http://schemas.microsoft.com/office/word/2010/wordprocessingGroup" xmlns:wpi="http://schemas.microsoft.com/office/word/2010/wordprocessingInk" xmlns:wne="http://schemas.microsoft.com/office/word/2006/wordml" xmlns:wps="http://schemas.microsoft.com/office/word/2010/wordprocessingShape" mc:Ignorable="w14 w15 w16se w16cid w16 w16cex w16sdtdh w16sdtfl w16du wp14">
+  <w:p>
+    <w:pPr>
+      <w:pStyle w:val="Header"/>
+    </w:pPr>
+  </w:p>
+</w:hdr>
+</file>
+
+<file path=word/header3.xml><?xml version="1.0" encoding="utf-8"?>
+<w:hdr xmlns:wpc="http://schemas.microsoft.com/office/word/2010/wordprocessingCanvas" xmlns:cx="http://schemas.microsoft.com/office/drawing/2014/chartex" xmlns:cx1="http://schemas.microsoft.com/office/drawing/2015/9/8/chartex" xmlns:cx2="http://schemas.microsoft.com/office/drawing/2015/10/21/chartex" xmlns:cx3="http://schemas.microsoft.com/office/drawing/2016/5/9/chartex" xmlns:cx4="http://schemas.microsoft.com/office/drawing/2016/5/10/chartex" xmlns:cx5="http://schemas.microsoft.com/office/drawing/2016/5/11/chartex" xmlns:cx6="http://schemas.microsoft.com/office/drawing/2016/5/12/chartex" xmlns:cx7="http://schemas.microsoft.com/office/drawing/2016/5/13/chartex" xmlns:cx8="http://schemas.microsoft.com/office/drawing/2016/5/14/chartex" xmlns:mc="http://schemas.openxmlformats.org/markup-compatibility/2006" xmlns:aink="http://schemas.microsoft.com/office/drawing/2016/ink" xmlns:am3d="http://schemas.microsoft.com/office/drawing/2017/model3d" xmlns:o="urn:schemas-microsoft-com:office:office" xmlns:oel="http://schemas.microsoft.com/office/2019/extlst" xmlns:r="http://schemas.openxmlformats.org/officeDocument/2006/relationships" xmlns:m="http://schemas.openxmlformats.org/officeDocument/2006/math" xmlns:v="urn:schemas-microsoft-com:vml" xmlns:wp14="http://schemas.microsoft.com/office/word/2010/wordprocessingDrawing" xmlns:wp="http://schemas.openxmlformats.org/drawingml/2006/wordprocessingDrawing" xmlns:w10="urn:schemas-microsoft-com:office:word" xmlns:w="http://schemas.openxmlformats.org/wordprocessingml/2006/main" xmlns:w14="http://schemas.microsoft.com/office/word/2010/wordml" xmlns:w15="http://schemas.microsoft.com/office/word/2012/wordml" xmlns:w16cex="http://schemas.microsoft.com/office/word/2018/wordml/cex" xmlns:w16cid="http://schemas.microsoft.com/office/word/2016/wordml/cid" xmlns:w16="http://schemas.microsoft.com/office/word/2018/wordml" xmlns:w16du="http://schemas.microsoft.com/office/word/2023/wordml/word16du" xmlns:w16sdtdh="http://schemas.microsoft.com/office/word/2020/wordml/sdtdatahash" xmlns:w16sdtfl="http://schemas.microsoft.com/office/word/2024/wordml/sdtformatlock" xmlns:w16se="http://schemas.microsoft.com/office/word/2015/wordml/symex" xmlns:wpg="http://schemas.microsoft.com/office/word/2010/wordprocessingGroup" xmlns:wpi="http://schemas.microsoft.com/office/word/2010/wordprocessingInk" xmlns:wne="http://schemas.microsoft.com/office/word/2006/wordml" xmlns:wps="http://schemas.microsoft.com/office/word/2010/wordprocessingShape" mc:Ignorable="w14 w15 w16se w16cid w16 w16cex w16sdtdh w16sdtfl w16du wp14">
+  <w:p>
+    <w:pPr>
+      <w:pStyle w:val="Header"/>
+    </w:pPr>
+  </w:p>
+</w:hdr>
+</file>
+
 <file path=word/numbering.xml><?xml version="1.0" encoding="utf-8"?>
 <w:numbering xmlns:wpc="http://schemas.microsoft.com/office/word/2010/wordprocessingCanvas" xmlns:cx="http://schemas.microsoft.com/office/drawing/2014/chartex" xmlns:cx1="http://schemas.microsoft.com/office/drawing/2015/9/8/chartex" xmlns:cx2="http://schemas.microsoft.com/office/drawing/2015/10/21/chartex" xmlns:cx3="http://schemas.microsoft.com/office/drawing/2016/5/9/chartex" xmlns:cx4="http://schemas.microsoft.com/office/drawing/2016/5/10/chartex" xmlns:cx5="http://schemas.microsoft.com/office/drawing/2016/5/11/chartex" xmlns:cx6="http://schemas.microsoft.com/office/drawing/2016/5/12/chartex" xmlns:cx7="http://schemas.microsoft.com/office/drawing/2016/5/13/chartex" xmlns:cx8="http://schemas.microsoft.com/office/drawing/2016/5/14/chartex" xmlns:mc="http://schemas.openxmlformats.org/markup-compatibility/2006" xmlns:aink="http://schemas.microsoft.com/office/drawing/2016/ink" xmlns:am3d="http://schemas.microsoft.com/office/drawing/2017/model3d" xmlns:o="urn:schemas-microsoft-com:office:office" xmlns:oel="http://schemas.microsoft.com/office/2019/extlst" xmlns:r="http://schemas.openxmlformats.org/officeDocument/2006/relationships" xmlns:m="http://schemas.openxmlformats.org/officeDocument/2006/math" xmlns:v="urn:schemas-microsoft-com:vml" xmlns:wp14="http://schemas.microsoft.com/office/word/2010/wordprocessingDrawing" xmlns:wp="http://schemas.openxmlformats.org/drawingml/2006/wordprocessingDrawing" xmlns:w10="urn:schemas-microsoft-com:office:word" xmlns:w="http://schemas.openxmlformats.org/wordprocessingml/2006/main" xmlns:w14="http://schemas.microsoft.com/office/word/2010/wordml" xmlns:w15="http://schemas.microsoft.com/office/word/2012/wordml" xmlns:w16cex="http://schemas.microsoft.com/office/word/2018/wordml/cex" xmlns:w16cid="http://schemas.microsoft.com/office/word/2016/wordml/cid" xmlns:w16="http://schemas.microsoft.com/office/word/2018/wordml" xmlns:w16du="http://schemas.microsoft.com/office/word/2023/wordml/word16du" xmlns:w16sdtdh="http://schemas.microsoft.com/office/word/2020/wordml/sdtdatahash" xmlns:w16sdtfl="http://schemas.microsoft.com/office/word/2024/wordml/sdtformatlock" xmlns:w16se="http://schemas.microsoft.com/office/word/2015/wordml/symex" xmlns:wpg="http://schemas.microsoft.com/office/word/2010/wordprocessingGroup" xmlns:wpi="http://schemas.microsoft.com/office/word/2010/wordprocessingInk" xmlns:wne="http://schemas.microsoft.com/office/word/2006/wordml" xmlns:wps="http://schemas.microsoft.com/office/word/2010/wordprocessingShape" mc:Ignorable="w14 w15 w16se w16cid w16 w16cex w16sdtdh w16sdtfl w16du wp14">
   <w:abstractNum w:abstractNumId="0" w15:restartNumberingAfterBreak="0">
+    <w:nsid w:val="2915554B"/>
+    <w:multiLevelType w:val="multilevel"/>
+    <w:tmpl w:val="E6C6F3C6"/>
+    <w:lvl w:ilvl="0">
+      <w:start w:val="1"/>
+      <w:numFmt w:val="bullet"/>
+      <w:lvlText w:val=""/>
+      <w:lvlJc w:val="left"/>
+      <w:pPr>
+        <w:tabs>
+          <w:tab w:val="num" w:pos="720"/>
+        </w:tabs>
+        <w:ind w:left="720" w:hanging="360"/>
+      </w:pPr>
+      <w:rPr>
+        <w:rFonts w:ascii="Symbol" w:hAnsi="Symbol" w:hint="default"/>
+        <w:sz w:val="20"/>
+      </w:rPr>
+    </w:lvl>
+    <w:lvl w:ilvl="1" w:tentative="1">
+      <w:start w:val="1"/>
+      <w:numFmt w:val="bullet"/>
+      <w:lvlText w:val="o"/>
+      <w:lvlJc w:val="left"/>
+      <w:pPr>
+        <w:tabs>
+          <w:tab w:val="num" w:pos="1440"/>
+        </w:tabs>
+        <w:ind w:left="1440" w:hanging="360"/>
+      </w:pPr>
+      <w:rPr>
+        <w:rFonts w:ascii="Courier New" w:hAnsi="Courier New" w:hint="default"/>
+        <w:sz w:val="20"/>
+      </w:rPr>
+    </w:lvl>
+    <w:lvl w:ilvl="2" w:tentative="1">
+      <w:start w:val="1"/>
+      <w:numFmt w:val="bullet"/>
+      <w:lvlText w:val=""/>
+      <w:lvlJc w:val="left"/>
+      <w:pPr>
+        <w:tabs>
+          <w:tab w:val="num" w:pos="2160"/>
+        </w:tabs>
+        <w:ind w:left="2160" w:hanging="360"/>
+      </w:pPr>
+      <w:rPr>
+        <w:rFonts w:ascii="Wingdings" w:hAnsi="Wingdings" w:hint="default"/>
+        <w:sz w:val="20"/>
+      </w:rPr>
+    </w:lvl>
+    <w:lvl w:ilvl="3" w:tentative="1">
+      <w:start w:val="1"/>
+      <w:numFmt w:val="bullet"/>
+      <w:lvlText w:val=""/>
+      <w:lvlJc w:val="left"/>
+      <w:pPr>
+        <w:tabs>
+          <w:tab w:val="num" w:pos="2880"/>
+        </w:tabs>
+        <w:ind w:left="2880" w:hanging="360"/>
+      </w:pPr>
+      <w:rPr>
+        <w:rFonts w:ascii="Wingdings" w:hAnsi="Wingdings" w:hint="default"/>
+        <w:sz w:val="20"/>
+      </w:rPr>
+    </w:lvl>
+    <w:lvl w:ilvl="4" w:tentative="1">
+      <w:start w:val="1"/>
+      <w:numFmt w:val="bullet"/>
+      <w:lvlText w:val=""/>
+      <w:lvlJc w:val="left"/>
+      <w:pPr>
+        <w:tabs>
+          <w:tab w:val="num" w:pos="3600"/>
+        </w:tabs>
+        <w:ind w:left="3600" w:hanging="360"/>
+      </w:pPr>
+      <w:rPr>
+        <w:rFonts w:ascii="Wingdings" w:hAnsi="Wingdings" w:hint="default"/>
+        <w:sz w:val="20"/>
+      </w:rPr>
+    </w:lvl>
+    <w:lvl w:ilvl="5" w:tentative="1">
+      <w:start w:val="1"/>
+      <w:numFmt w:val="bullet"/>
+      <w:lvlText w:val=""/>
+      <w:lvlJc w:val="left"/>
+      <w:pPr>
+        <w:tabs>
+          <w:tab w:val="num" w:pos="4320"/>
+        </w:tabs>
+        <w:ind w:left="4320" w:hanging="360"/>
+      </w:pPr>
+      <w:rPr>
+        <w:rFonts w:ascii="Wingdings" w:hAnsi="Wingdings" w:hint="default"/>
+        <w:sz w:val="20"/>
+      </w:rPr>
+    </w:lvl>
+    <w:lvl w:ilvl="6" w:tentative="1">
+      <w:start w:val="1"/>
+      <w:numFmt w:val="bullet"/>
+      <w:lvlText w:val=""/>
+      <w:lvlJc w:val="left"/>
+      <w:pPr>
+        <w:tabs>
+          <w:tab w:val="num" w:pos="5040"/>
+        </w:tabs>
+        <w:ind w:left="5040" w:hanging="360"/>
+      </w:pPr>
+      <w:rPr>
+        <w:rFonts w:ascii="Wingdings" w:hAnsi="Wingdings" w:hint="default"/>
+        <w:sz w:val="20"/>
+      </w:rPr>
+    </w:lvl>
+    <w:lvl w:ilvl="7" w:tentative="1">
+      <w:start w:val="1"/>
+      <w:numFmt w:val="bullet"/>
+      <w:lvlText w:val=""/>
+      <w:lvlJc w:val="left"/>
+      <w:pPr>
+        <w:tabs>
+          <w:tab w:val="num" w:pos="5760"/>
+        </w:tabs>
+        <w:ind w:left="5760" w:hanging="360"/>
+      </w:pPr>
+      <w:rPr>
+        <w:rFonts w:ascii="Wingdings" w:hAnsi="Wingdings" w:hint="default"/>
+        <w:sz w:val="20"/>
+      </w:rPr>
+    </w:lvl>
+    <w:lvl w:ilvl="8" w:tentative="1">
+      <w:start w:val="1"/>
+      <w:numFmt w:val="bullet"/>
+      <w:lvlText w:val=""/>
+      <w:lvlJc w:val="left"/>
+      <w:pPr>
+        <w:tabs>
+          <w:tab w:val="num" w:pos="6480"/>
+        </w:tabs>
+        <w:ind w:left="6480" w:hanging="360"/>
+      </w:pPr>
+      <w:rPr>
+        <w:rFonts w:ascii="Wingdings" w:hAnsi="Wingdings" w:hint="default"/>
+        <w:sz w:val="20"/>
+      </w:rPr>
+    </w:lvl>
+  </w:abstractNum>
+  <w:abstractNum w:abstractNumId="1" w15:restartNumberingAfterBreak="0">
     <w:nsid w:val="3B4A56BE"/>
     <w:multiLevelType w:val="hybridMultilevel"/>
     <w:tmpl w:val="1FDC83C6"/>
@@ -1769,7 +2104,7 @@
       </w:rPr>
     </w:lvl>
   </w:abstractNum>
-  <w:abstractNum w:abstractNumId="1" w15:restartNumberingAfterBreak="0">
+  <w:abstractNum w:abstractNumId="2" w15:restartNumberingAfterBreak="0">
     <w:nsid w:val="4A72411C"/>
     <w:multiLevelType w:val="hybridMultilevel"/>
     <w:tmpl w:val="FEC43580"/>
@@ -1882,7 +2217,7 @@
       </w:rPr>
     </w:lvl>
   </w:abstractNum>
-  <w:abstractNum w:abstractNumId="2" w15:restartNumberingAfterBreak="0">
+  <w:abstractNum w:abstractNumId="3" w15:restartNumberingAfterBreak="0">
     <w:nsid w:val="54004A50"/>
     <w:multiLevelType w:val="multilevel"/>
     <w:tmpl w:val="AE1AB688"/>
@@ -2021,7 +2356,7 @@
       </w:rPr>
     </w:lvl>
   </w:abstractNum>
-  <w:abstractNum w:abstractNumId="3" w15:restartNumberingAfterBreak="0">
+  <w:abstractNum w:abstractNumId="4" w15:restartNumberingAfterBreak="0">
     <w:nsid w:val="5506187B"/>
     <w:multiLevelType w:val="multilevel"/>
     <w:tmpl w:val="931293D4"/>
@@ -2134,7 +2469,7 @@
       </w:rPr>
     </w:lvl>
   </w:abstractNum>
-  <w:abstractNum w:abstractNumId="4" w15:restartNumberingAfterBreak="0">
+  <w:abstractNum w:abstractNumId="5" w15:restartNumberingAfterBreak="0">
     <w:nsid w:val="58B96E54"/>
     <w:multiLevelType w:val="hybridMultilevel"/>
     <w:tmpl w:val="9DBCB54E"/>
@@ -2247,7 +2582,7 @@
       </w:rPr>
     </w:lvl>
   </w:abstractNum>
-  <w:abstractNum w:abstractNumId="5" w15:restartNumberingAfterBreak="0">
+  <w:abstractNum w:abstractNumId="6" w15:restartNumberingAfterBreak="0">
     <w:nsid w:val="5CD51EC8"/>
     <w:multiLevelType w:val="multilevel"/>
     <w:tmpl w:val="2C18220A"/>
@@ -2360,7 +2695,7 @@
       </w:rPr>
     </w:lvl>
   </w:abstractNum>
-  <w:abstractNum w:abstractNumId="6" w15:restartNumberingAfterBreak="0">
+  <w:abstractNum w:abstractNumId="7" w15:restartNumberingAfterBreak="0">
     <w:nsid w:val="69D01878"/>
     <w:multiLevelType w:val="hybridMultilevel"/>
     <w:tmpl w:val="4DB0E1CA"/>
@@ -2473,7 +2808,7 @@
       </w:rPr>
     </w:lvl>
   </w:abstractNum>
-  <w:abstractNum w:abstractNumId="7" w15:restartNumberingAfterBreak="0">
+  <w:abstractNum w:abstractNumId="8" w15:restartNumberingAfterBreak="0">
     <w:nsid w:val="735E2970"/>
     <w:multiLevelType w:val="hybridMultilevel"/>
     <w:tmpl w:val="F03237D6"/>
@@ -2586,7 +2921,7 @@
       </w:rPr>
     </w:lvl>
   </w:abstractNum>
-  <w:abstractNum w:abstractNumId="8" w15:restartNumberingAfterBreak="0">
+  <w:abstractNum w:abstractNumId="9" w15:restartNumberingAfterBreak="0">
     <w:nsid w:val="7CFC2134"/>
     <w:multiLevelType w:val="hybridMultilevel"/>
     <w:tmpl w:val="0EA2A8FA"/>
@@ -2700,31 +3035,34 @@
     </w:lvl>
   </w:abstractNum>
   <w:num w:numId="1" w16cid:durableId="1405033691">
+    <w:abstractNumId w:val="4"/>
+  </w:num>
+  <w:num w:numId="2" w16cid:durableId="764309298">
+    <w:abstractNumId w:val="6"/>
+  </w:num>
+  <w:num w:numId="3" w16cid:durableId="81487325">
     <w:abstractNumId w:val="3"/>
   </w:num>
-  <w:num w:numId="2" w16cid:durableId="764309298">
+  <w:num w:numId="4" w16cid:durableId="1408502693">
     <w:abstractNumId w:val="5"/>
   </w:num>
-  <w:num w:numId="3" w16cid:durableId="81487325">
+  <w:num w:numId="5" w16cid:durableId="1063868427">
+    <w:abstractNumId w:val="8"/>
+  </w:num>
+  <w:num w:numId="6" w16cid:durableId="72774841">
+    <w:abstractNumId w:val="1"/>
+  </w:num>
+  <w:num w:numId="7" w16cid:durableId="90712469">
+    <w:abstractNumId w:val="9"/>
+  </w:num>
+  <w:num w:numId="8" w16cid:durableId="1953393145">
     <w:abstractNumId w:val="2"/>
   </w:num>
-  <w:num w:numId="4" w16cid:durableId="1408502693">
-    <w:abstractNumId w:val="4"/>
-  </w:num>
-  <w:num w:numId="5" w16cid:durableId="1063868427">
+  <w:num w:numId="9" w16cid:durableId="124079361">
     <w:abstractNumId w:val="7"/>
   </w:num>
-  <w:num w:numId="6" w16cid:durableId="72774841">
+  <w:num w:numId="10" w16cid:durableId="1227648539">
     <w:abstractNumId w:val="0"/>
-  </w:num>
-  <w:num w:numId="7" w16cid:durableId="90712469">
-    <w:abstractNumId w:val="8"/>
-  </w:num>
-  <w:num w:numId="8" w16cid:durableId="1953393145">
-    <w:abstractNumId w:val="1"/>
-  </w:num>
-  <w:num w:numId="9" w16cid:durableId="124079361">
-    <w:abstractNumId w:val="6"/>
   </w:num>
 </w:numbering>
 </file>
@@ -3346,6 +3684,66 @@
       <w:contextualSpacing/>
     </w:pPr>
   </w:style>
+  <w:style w:type="paragraph" w:styleId="Header">
+    <w:name w:val="header"/>
+    <w:basedOn w:val="Normal"/>
+    <w:link w:val="HeaderChar"/>
+    <w:uiPriority w:val="99"/>
+    <w:unhideWhenUsed/>
+    <w:rsid w:val="005350E9"/>
+    <w:pPr>
+      <w:tabs>
+        <w:tab w:val="center" w:pos="4513"/>
+        <w:tab w:val="right" w:pos="9026"/>
+      </w:tabs>
+      <w:spacing w:line="240" w:lineRule="auto"/>
+    </w:pPr>
+  </w:style>
+  <w:style w:type="character" w:customStyle="1" w:styleId="HeaderChar">
+    <w:name w:val="Header Char"/>
+    <w:basedOn w:val="DefaultParagraphFont"/>
+    <w:link w:val="Header"/>
+    <w:uiPriority w:val="99"/>
+    <w:rsid w:val="005350E9"/>
+  </w:style>
+  <w:style w:type="paragraph" w:styleId="Footer">
+    <w:name w:val="footer"/>
+    <w:basedOn w:val="Normal"/>
+    <w:link w:val="FooterChar"/>
+    <w:uiPriority w:val="99"/>
+    <w:unhideWhenUsed/>
+    <w:rsid w:val="005350E9"/>
+    <w:pPr>
+      <w:tabs>
+        <w:tab w:val="center" w:pos="4513"/>
+        <w:tab w:val="right" w:pos="9026"/>
+      </w:tabs>
+      <w:spacing w:line="240" w:lineRule="auto"/>
+    </w:pPr>
+  </w:style>
+  <w:style w:type="character" w:customStyle="1" w:styleId="FooterChar">
+    <w:name w:val="Footer Char"/>
+    <w:basedOn w:val="DefaultParagraphFont"/>
+    <w:link w:val="Footer"/>
+    <w:uiPriority w:val="99"/>
+    <w:rsid w:val="005350E9"/>
+  </w:style>
+  <w:style w:type="paragraph" w:styleId="NormalWeb">
+    <w:name w:val="Normal (Web)"/>
+    <w:basedOn w:val="Normal"/>
+    <w:uiPriority w:val="99"/>
+    <w:unhideWhenUsed/>
+    <w:rsid w:val="005350E9"/>
+    <w:pPr>
+      <w:spacing w:before="100" w:beforeAutospacing="1" w:after="100" w:afterAutospacing="1" w:line="240" w:lineRule="auto"/>
+    </w:pPr>
+    <w:rPr>
+      <w:rFonts w:ascii="Times New Roman" w:eastAsia="Times New Roman" w:hAnsi="Times New Roman" w:cs="Times New Roman"/>
+      <w:sz w:val="24"/>
+      <w:szCs w:val="24"/>
+      <w:lang w:val="en-HR" w:eastAsia="en-GB"/>
+    </w:rPr>
+  </w:style>
 </w:styles>
 </file>
 

</xml_diff>